<commit_message>
Sync updated resumes and add resume recommendation to built-in JD analysis
Resumes: Business Intelligence and Product Manager (renamed to Product
Management) were updated on disk with new experience bullets (PostHog
event tracking, user-interview-driven feature launches, ETL/BigQuery
pipeline work). Re-extracted resume-library.json in both
resume-templates/ and extension/, and renamed the resume tag
throughout (index.html dropdown, extension RESUME_TAGS, docs/job-keywords.md).

Built-in AI analysis (index.html analyzeJDNative): now loads the full
resume library and asks Gemini to recommend a resume version, matching
the extension's behavior. scanAIContent() parses the new 建議履歷/履歷理由
lines into the resume tag dropdown and notes, using anchored line-start
matching so "建議履歷" no longer gets swept into the generic "建議"
advice-notes filter.
</commit_message>
<xml_diff>
--- a/resume-templates/Business Intelligence.docx
+++ b/resume-templates/Business Intelligence.docx
@@ -10,7 +10,7 @@
           <w:bottom w:color="000000" w:space="0" w:sz="6" w:val="single"/>
           <w:right w:color="000000" w:space="0" w:sz="0" w:val="none"/>
         </w:pBdr>
-        <w:spacing w:after="30" w:line="192.00000000000003" w:lineRule="auto"/>
+        <w:spacing w:after="18" w:line="216" w:lineRule="auto"/>
         <w:ind w:left="-540" w:right="-720" w:hanging="180"/>
         <w:rPr>
           <w:rFonts w:ascii="Times New Roman" w:cs="Times New Roman" w:eastAsia="Times New Roman" w:hAnsi="Times New Roman"/>
@@ -39,7 +39,7 @@
         <w:tabs>
           <w:tab w:val="right" w:leader="none" w:pos="10770"/>
         </w:tabs>
-        <w:spacing w:after="30" w:line="192.00000000000003" w:lineRule="auto"/>
+        <w:spacing w:after="18" w:line="216" w:lineRule="auto"/>
         <w:ind w:left="-540" w:right="-720" w:hanging="180"/>
         <w:rPr>
           <w:rFonts w:ascii="Calibri" w:cs="Calibri" w:eastAsia="Calibri" w:hAnsi="Calibri"/>
@@ -68,7 +68,7 @@
         <w:tabs>
           <w:tab w:val="right" w:leader="none" w:pos="10770"/>
         </w:tabs>
-        <w:spacing w:after="30" w:line="192.00000000000003" w:lineRule="auto"/>
+        <w:spacing w:after="18" w:line="216" w:lineRule="auto"/>
         <w:ind w:left="-540" w:right="-720" w:hanging="180"/>
         <w:rPr>
           <w:rFonts w:ascii="Calibri" w:cs="Calibri" w:eastAsia="Calibri" w:hAnsi="Calibri"/>
@@ -95,7 +95,7 @@
     </w:p>
     <w:p>
       <w:pPr>
-        <w:spacing w:after="30" w:line="192.00000000000003" w:lineRule="auto"/>
+        <w:spacing w:after="18" w:line="216" w:lineRule="auto"/>
         <w:ind w:left="-540" w:right="-720" w:hanging="180"/>
         <w:rPr>
           <w:rFonts w:ascii="Calibri" w:cs="Calibri" w:eastAsia="Calibri" w:hAnsi="Calibri"/>
@@ -114,7 +114,7 @@
         <w:tabs>
           <w:tab w:val="right" w:leader="none" w:pos="10770"/>
         </w:tabs>
-        <w:spacing w:after="30" w:line="192.00000000000003" w:lineRule="auto"/>
+        <w:spacing w:after="18" w:line="216" w:lineRule="auto"/>
         <w:ind w:left="-540" w:right="-720" w:hanging="180"/>
         <w:rPr>
           <w:rFonts w:ascii="Calibri" w:cs="Calibri" w:eastAsia="Calibri" w:hAnsi="Calibri"/>
@@ -143,7 +143,7 @@
         <w:tabs>
           <w:tab w:val="right" w:leader="none" w:pos="10770"/>
         </w:tabs>
-        <w:spacing w:after="30" w:line="192.00000000000003" w:lineRule="auto"/>
+        <w:spacing w:after="18" w:line="216" w:lineRule="auto"/>
         <w:ind w:left="-540" w:right="-720" w:hanging="180"/>
         <w:rPr>
           <w:rFonts w:ascii="Calibri" w:cs="Calibri" w:eastAsia="Calibri" w:hAnsi="Calibri"/>
@@ -173,7 +173,7 @@
         <w:tabs>
           <w:tab w:val="right" w:leader="none" w:pos="10770"/>
         </w:tabs>
-        <w:spacing w:after="30" w:line="192.00000000000003" w:lineRule="auto"/>
+        <w:spacing w:after="18" w:line="216" w:lineRule="auto"/>
         <w:ind w:left="-540" w:right="-720" w:hanging="180"/>
         <w:rPr>
           <w:rFonts w:ascii="Calibri" w:cs="Calibri" w:eastAsia="Calibri" w:hAnsi="Calibri"/>
@@ -241,7 +241,7 @@
           <w:rtl w:val="0"/>
         </w:rPr>
         <w:tab/>
-        <w:t xml:space="preserve">June 2026 - Present</w:t>
+        <w:t xml:space="preserve">June 2026 - August 2026</w:t>
       </w:r>
     </w:p>
     <w:p>
@@ -266,6 +266,129 @@
         <w:t xml:space="preserve">Hawl Technology (LLC)</w:t>
         <w:tab/>
         <w:t xml:space="preserve">United States (Remote)</w:t>
+      </w:r>
+      <w:r>
+        <w:rPr>
+          <w:rtl w:val="0"/>
+        </w:rPr>
+      </w:r>
+    </w:p>
+    <w:p>
+      <w:pPr>
+        <w:numPr>
+          <w:ilvl w:val="0"/>
+          <w:numId w:val="1"/>
+        </w:numPr>
+        <w:tabs>
+          <w:tab w:val="right" w:leader="none" w:pos="10770"/>
+        </w:tabs>
+        <w:spacing w:after="18" w:line="216" w:lineRule="auto"/>
+        <w:ind w:left="-180" w:right="-720" w:hanging="270"/>
+        <w:rPr>
+          <w:rFonts w:ascii="Calibri" w:cs="Calibri" w:eastAsia="Calibri" w:hAnsi="Calibri"/>
+        </w:rPr>
+      </w:pPr>
+      <w:r>
+        <w:rPr>
+          <w:rFonts w:ascii="Calibri" w:cs="Calibri" w:eastAsia="Calibri" w:hAnsi="Calibri"/>
+          <w:rtl w:val="0"/>
+        </w:rPr>
+        <w:t xml:space="preserve">Built feature-tracking dashboard surfacing adoption metrics, segment-specific usage patterns, and issue discovery timeline; identified data-driven optimization priorities and enabled post-launch performance analysis</w:t>
+      </w:r>
+    </w:p>
+    <w:p>
+      <w:pPr>
+        <w:numPr>
+          <w:ilvl w:val="0"/>
+          <w:numId w:val="1"/>
+        </w:numPr>
+        <w:tabs>
+          <w:tab w:val="right" w:leader="none" w:pos="10770"/>
+        </w:tabs>
+        <w:spacing w:after="18" w:line="216" w:lineRule="auto"/>
+        <w:ind w:left="-180" w:right="-720" w:hanging="270"/>
+        <w:rPr>
+          <w:rFonts w:ascii="Calibri" w:cs="Calibri" w:eastAsia="Calibri" w:hAnsi="Calibri"/>
+        </w:rPr>
+      </w:pPr>
+      <w:r>
+        <w:rPr>
+          <w:rFonts w:ascii="Calibri" w:cs="Calibri" w:eastAsia="Calibri" w:hAnsi="Calibri"/>
+          <w:rtl w:val="0"/>
+        </w:rPr>
+        <w:t xml:space="preserve">Implemented PostHog event tracking system; designed cohort analysis to surface segment-specific adoption patterns and engagement drivers</w:t>
+      </w:r>
+    </w:p>
+    <w:p>
+      <w:pPr>
+        <w:tabs>
+          <w:tab w:val="right" w:leader="none" w:pos="10770"/>
+        </w:tabs>
+        <w:spacing w:after="18" w:line="216" w:lineRule="auto"/>
+        <w:ind w:left="720" w:right="-720" w:firstLine="0"/>
+        <w:rPr>
+          <w:rFonts w:ascii="Calibri" w:cs="Calibri" w:eastAsia="Calibri" w:hAnsi="Calibri"/>
+          <w:sz w:val="8"/>
+          <w:szCs w:val="8"/>
+        </w:rPr>
+      </w:pPr>
+      <w:r>
+        <w:rPr>
+          <w:rtl w:val="0"/>
+        </w:rPr>
+      </w:r>
+    </w:p>
+    <w:p>
+      <w:pPr>
+        <w:tabs>
+          <w:tab w:val="right" w:leader="none" w:pos="10770"/>
+        </w:tabs>
+        <w:spacing w:after="18" w:line="216" w:lineRule="auto"/>
+        <w:ind w:left="-540" w:right="-720" w:hanging="180"/>
+        <w:rPr>
+          <w:rFonts w:ascii="Calibri" w:cs="Calibri" w:eastAsia="Calibri" w:hAnsi="Calibri"/>
+        </w:rPr>
+      </w:pPr>
+      <w:r>
+        <w:rPr>
+          <w:rFonts w:ascii="Calibri" w:cs="Calibri" w:eastAsia="Calibri" w:hAnsi="Calibri"/>
+          <w:b w:val="1"/>
+          <w:bCs w:val="1"/>
+          <w:rtl w:val="0"/>
+        </w:rPr>
+        <w:t xml:space="preserve">Data &amp; Tech Intern</w:t>
+      </w:r>
+      <w:r>
+        <w:rPr>
+          <w:rFonts w:ascii="Calibri" w:cs="Calibri" w:eastAsia="Calibri" w:hAnsi="Calibri"/>
+          <w:rtl w:val="0"/>
+        </w:rPr>
+        <w:tab/>
+        <w:t xml:space="preserve">June 2026 - Present</w:t>
+      </w:r>
+    </w:p>
+    <w:p>
+      <w:pPr>
+        <w:tabs>
+          <w:tab w:val="right" w:leader="none" w:pos="10770"/>
+        </w:tabs>
+        <w:spacing w:after="18" w:line="216" w:lineRule="auto"/>
+        <w:ind w:left="-540" w:right="-720" w:hanging="180"/>
+        <w:rPr>
+          <w:b w:val="1"/>
+          <w:bCs w:val="1"/>
+          <w:sz w:val="19"/>
+          <w:szCs w:val="19"/>
+        </w:rPr>
+      </w:pPr>
+      <w:r>
+        <w:rPr>
+          <w:rFonts w:ascii="Calibri" w:cs="Calibri" w:eastAsia="Calibri" w:hAnsi="Calibri"/>
+          <w:rtl w:val="0"/>
+        </w:rPr>
+        <w:t xml:space="preserve">Omnicom (LLC)</w:t>
+        <w:tab/>
+        <w:t xml:space="preserve">Taipei City, TW</w:t>
       </w:r>
       <w:r>
         <w:rPr>
@@ -306,7 +429,7 @@
           <w:rFonts w:ascii="Calibri" w:cs="Calibri" w:eastAsia="Calibri" w:hAnsi="Calibri"/>
           <w:rtl w:val="0"/>
         </w:rPr>
-        <w:t xml:space="preserve">Proposed and built a feature-tracking system to monitor the rollout of two new product features, improving cross-team reporting visibility</w:t>
+        <w:t xml:space="preserve">Built a CPA prediction model by audience segment and seasonality, enabling data-driven budget planning and client negotiation at the proposal stage.</w:t>
       </w:r>
     </w:p>
     <w:p>
@@ -342,84 +465,7 @@
           <w:rFonts w:ascii="Calibri" w:cs="Calibri" w:eastAsia="Calibri" w:hAnsi="Calibri"/>
           <w:rtl w:val="0"/>
         </w:rPr>
-        <w:t xml:space="preserve">Built a custom Claude skill to systematize the product test documentation update process, standardizing formatting and eliminating manual inconsistencies</w:t>
-      </w:r>
-    </w:p>
-    <w:p>
-      <w:pPr>
-        <w:tabs>
-          <w:tab w:val="right" w:leader="none" w:pos="10770"/>
-        </w:tabs>
-        <w:spacing w:after="18" w:line="216" w:lineRule="auto"/>
-        <w:ind w:left="720" w:right="-720" w:firstLine="0"/>
-        <w:rPr>
-          <w:rFonts w:ascii="Calibri" w:cs="Calibri" w:eastAsia="Calibri" w:hAnsi="Calibri"/>
-          <w:sz w:val="8"/>
-          <w:szCs w:val="8"/>
-        </w:rPr>
-      </w:pPr>
-      <w:r>
-        <w:rPr>
-          <w:rtl w:val="0"/>
-        </w:rPr>
-      </w:r>
-    </w:p>
-    <w:p>
-      <w:pPr>
-        <w:tabs>
-          <w:tab w:val="right" w:leader="none" w:pos="10770"/>
-        </w:tabs>
-        <w:spacing w:after="18" w:line="216" w:lineRule="auto"/>
-        <w:ind w:left="-540" w:right="-720" w:hanging="180"/>
-        <w:rPr>
-          <w:rFonts w:ascii="Calibri" w:cs="Calibri" w:eastAsia="Calibri" w:hAnsi="Calibri"/>
-        </w:rPr>
-      </w:pPr>
-      <w:r>
-        <w:rPr>
-          <w:rFonts w:ascii="Calibri" w:cs="Calibri" w:eastAsia="Calibri" w:hAnsi="Calibri"/>
-          <w:b w:val="1"/>
-          <w:bCs w:val="1"/>
-          <w:rtl w:val="0"/>
-        </w:rPr>
-        <w:t xml:space="preserve">Data &amp; Tech Intern</w:t>
-      </w:r>
-      <w:r>
-        <w:rPr>
-          <w:rFonts w:ascii="Calibri" w:cs="Calibri" w:eastAsia="Calibri" w:hAnsi="Calibri"/>
-          <w:rtl w:val="0"/>
-        </w:rPr>
-        <w:tab/>
-        <w:t xml:space="preserve">June 2026 - August 2026</w:t>
-      </w:r>
-    </w:p>
-    <w:p>
-      <w:pPr>
-        <w:tabs>
-          <w:tab w:val="right" w:leader="none" w:pos="10770"/>
-        </w:tabs>
-        <w:spacing w:after="18" w:line="216" w:lineRule="auto"/>
-        <w:ind w:left="-540" w:right="-720" w:hanging="180"/>
-        <w:rPr>
-          <w:b w:val="1"/>
-          <w:bCs w:val="1"/>
-          <w:sz w:val="19"/>
-          <w:szCs w:val="19"/>
-        </w:rPr>
-      </w:pPr>
-      <w:r>
-        <w:rPr>
-          <w:rFonts w:ascii="Calibri" w:cs="Calibri" w:eastAsia="Calibri" w:hAnsi="Calibri"/>
-          <w:rtl w:val="0"/>
-        </w:rPr>
-        <w:t xml:space="preserve">Omnicom (LLC)</w:t>
-        <w:tab/>
-        <w:t xml:space="preserve">Taipei City, TW</w:t>
-      </w:r>
-      <w:r>
-        <w:rPr>
-          <w:rtl w:val="0"/>
-        </w:rPr>
+        <w:t xml:space="preserve">Built a Looker Studio dashboard monitoring 6 Cloud Run jobs with automated failure alerts, identified 12 inactive brands consuming 35% of API quota and coordinated deactivation, reducing pipeline errors by 60%.</w:t>
       </w:r>
     </w:p>
     <w:p>
@@ -455,7 +501,500 @@
           <w:rFonts w:ascii="Calibri" w:cs="Calibri" w:eastAsia="Calibri" w:hAnsi="Calibri"/>
           <w:rtl w:val="0"/>
         </w:rPr>
-        <w:t xml:space="preserve">Built a Looker Studio dashboard to monitor real-time status of 6 scheduled Cloud Run jobs, improving visibility into pipeline health</w:t>
+        <w:t xml:space="preserve">Designed and implemented a daily ETL pipeline from Meta API to BigQuery, reducing manual processing time by 99%.</w:t>
+      </w:r>
+      <w:r>
+        <w:rPr>
+          <w:rtl w:val="0"/>
+        </w:rPr>
+      </w:r>
+    </w:p>
+    <w:p>
+      <w:pPr>
+        <w:tabs>
+          <w:tab w:val="right" w:leader="none" w:pos="10770"/>
+        </w:tabs>
+        <w:spacing w:after="18" w:line="216" w:lineRule="auto"/>
+        <w:ind w:left="720" w:right="-720" w:firstLine="0"/>
+        <w:rPr>
+          <w:rFonts w:ascii="Calibri" w:cs="Calibri" w:eastAsia="Calibri" w:hAnsi="Calibri"/>
+          <w:sz w:val="8"/>
+          <w:szCs w:val="8"/>
+        </w:rPr>
+      </w:pPr>
+      <w:r>
+        <w:rPr>
+          <w:rtl w:val="0"/>
+        </w:rPr>
+      </w:r>
+    </w:p>
+    <w:p>
+      <w:pPr>
+        <w:tabs>
+          <w:tab w:val="right" w:leader="none" w:pos="10770"/>
+        </w:tabs>
+        <w:spacing w:after="18" w:line="216" w:lineRule="auto"/>
+        <w:ind w:left="-540" w:right="-720" w:hanging="180"/>
+        <w:rPr>
+          <w:rFonts w:ascii="Calibri" w:cs="Calibri" w:eastAsia="Calibri" w:hAnsi="Calibri"/>
+        </w:rPr>
+      </w:pPr>
+      <w:r>
+        <w:rPr>
+          <w:rFonts w:ascii="Calibri" w:cs="Calibri" w:eastAsia="Calibri" w:hAnsi="Calibri"/>
+          <w:b w:val="1"/>
+          <w:bCs w:val="1"/>
+          <w:rtl w:val="0"/>
+        </w:rPr>
+        <w:t xml:space="preserve">Marketing Intern</w:t>
+      </w:r>
+      <w:r>
+        <w:rPr>
+          <w:rFonts w:ascii="Calibri" w:cs="Calibri" w:eastAsia="Calibri" w:hAnsi="Calibri"/>
+          <w:rtl w:val="0"/>
+        </w:rPr>
+        <w:tab/>
+        <w:t xml:space="preserve">February 2024 - June 2024</w:t>
+      </w:r>
+    </w:p>
+    <w:p>
+      <w:pPr>
+        <w:tabs>
+          <w:tab w:val="right" w:leader="none" w:pos="10770"/>
+        </w:tabs>
+        <w:spacing w:after="18" w:line="216" w:lineRule="auto"/>
+        <w:ind w:left="-540" w:right="-720" w:hanging="180"/>
+        <w:rPr>
+          <w:b w:val="1"/>
+          <w:bCs w:val="1"/>
+          <w:sz w:val="19"/>
+          <w:szCs w:val="19"/>
+        </w:rPr>
+      </w:pPr>
+      <w:r>
+        <w:rPr>
+          <w:rFonts w:ascii="Calibri" w:cs="Calibri" w:eastAsia="Calibri" w:hAnsi="Calibri"/>
+          <w:rtl w:val="0"/>
+        </w:rPr>
+        <w:t xml:space="preserve">Growth Strategy (LLC)</w:t>
+        <w:tab/>
+        <w:t xml:space="preserve">Taipei City, TW</w:t>
+      </w:r>
+      <w:r>
+        <w:rPr>
+          <w:rtl w:val="0"/>
+        </w:rPr>
+      </w:r>
+    </w:p>
+    <w:p>
+      <w:pPr>
+        <w:numPr>
+          <w:ilvl w:val="0"/>
+          <w:numId w:val="1"/>
+        </w:numPr>
+        <w:tabs>
+          <w:tab w:val="right" w:leader="none" w:pos="10770"/>
+        </w:tabs>
+        <w:spacing w:after="18" w:line="216" w:lineRule="auto"/>
+        <w:ind w:left="-180" w:right="-720" w:hanging="270"/>
+        <w:rPr>
+          <w:rFonts w:ascii="Calibri" w:cs="Calibri" w:eastAsia="Calibri" w:hAnsi="Calibri"/>
+        </w:rPr>
+      </w:pPr>
+      <w:r>
+        <w:rPr>
+          <w:rFonts w:ascii="Calibri" w:cs="Calibri" w:eastAsia="Calibri" w:hAnsi="Calibri"/>
+          <w:rtl w:val="0"/>
+        </w:rPr>
+        <w:t xml:space="preserve">Conducted multi-industry market research; translated business requirements into structured, data-driven recommendations for product and packaging strategy optimization</w:t>
+      </w:r>
+    </w:p>
+    <w:p>
+      <w:pPr>
+        <w:numPr>
+          <w:ilvl w:val="0"/>
+          <w:numId w:val="1"/>
+        </w:numPr>
+        <w:tabs>
+          <w:tab w:val="right" w:leader="none" w:pos="10770"/>
+        </w:tabs>
+        <w:spacing w:after="18" w:line="216" w:lineRule="auto"/>
+        <w:ind w:left="-180" w:right="-720" w:hanging="270"/>
+        <w:rPr>
+          <w:rFonts w:ascii="Calibri" w:cs="Calibri" w:eastAsia="Calibri" w:hAnsi="Calibri"/>
+        </w:rPr>
+      </w:pPr>
+      <w:r>
+        <w:rPr>
+          <w:rFonts w:ascii="Calibri" w:cs="Calibri" w:eastAsia="Calibri" w:hAnsi="Calibri"/>
+          <w:rtl w:val="0"/>
+        </w:rPr>
+        <w:t xml:space="preserve">Maintained data tracking systems across 10+ client accounts, ensuring accuracy and consistency of campaign performance metrics</w:t>
+      </w:r>
+    </w:p>
+    <w:p>
+      <w:pPr>
+        <w:tabs>
+          <w:tab w:val="right" w:leader="none" w:pos="10770"/>
+        </w:tabs>
+        <w:spacing w:after="18" w:line="216" w:lineRule="auto"/>
+        <w:ind w:left="720" w:right="-720" w:firstLine="0"/>
+        <w:rPr>
+          <w:rFonts w:ascii="Calibri" w:cs="Calibri" w:eastAsia="Calibri" w:hAnsi="Calibri"/>
+          <w:sz w:val="8"/>
+          <w:szCs w:val="8"/>
+        </w:rPr>
+      </w:pPr>
+      <w:r>
+        <w:rPr>
+          <w:rtl w:val="0"/>
+        </w:rPr>
+      </w:r>
+    </w:p>
+    <w:p>
+      <w:pPr>
+        <w:tabs>
+          <w:tab w:val="right" w:leader="none" w:pos="10770"/>
+        </w:tabs>
+        <w:spacing w:after="18" w:line="216" w:lineRule="auto"/>
+        <w:ind w:left="-540" w:right="-720" w:hanging="180"/>
+        <w:rPr>
+          <w:rFonts w:ascii="Calibri" w:cs="Calibri" w:eastAsia="Calibri" w:hAnsi="Calibri"/>
+        </w:rPr>
+      </w:pPr>
+      <w:r>
+        <w:rPr>
+          <w:rFonts w:ascii="Calibri" w:cs="Calibri" w:eastAsia="Calibri" w:hAnsi="Calibri"/>
+          <w:b w:val="1"/>
+          <w:bCs w:val="1"/>
+          <w:rtl w:val="0"/>
+        </w:rPr>
+        <w:t xml:space="preserve">Founder</w:t>
+      </w:r>
+      <w:r>
+        <w:rPr>
+          <w:rFonts w:ascii="Calibri" w:cs="Calibri" w:eastAsia="Calibri" w:hAnsi="Calibri"/>
+          <w:rtl w:val="0"/>
+        </w:rPr>
+        <w:tab/>
+        <w:t xml:space="preserve">September 2023 - April 2024</w:t>
+      </w:r>
+    </w:p>
+    <w:p>
+      <w:pPr>
+        <w:tabs>
+          <w:tab w:val="right" w:leader="none" w:pos="10770"/>
+        </w:tabs>
+        <w:spacing w:after="18" w:line="216" w:lineRule="auto"/>
+        <w:ind w:left="-540" w:right="-720" w:hanging="180"/>
+        <w:rPr>
+          <w:b w:val="1"/>
+          <w:bCs w:val="1"/>
+          <w:sz w:val="19"/>
+          <w:szCs w:val="19"/>
+        </w:rPr>
+      </w:pPr>
+      <w:r>
+        <w:rPr>
+          <w:rFonts w:ascii="Calibri" w:cs="Calibri" w:eastAsia="Calibri" w:hAnsi="Calibri"/>
+          <w:rtl w:val="0"/>
+        </w:rPr>
+        <w:t xml:space="preserve">Pour.selection (Online shop)</w:t>
+        <w:tab/>
+        <w:t xml:space="preserve">New Taipei City, TW</w:t>
+      </w:r>
+      <w:r>
+        <w:rPr>
+          <w:rtl w:val="0"/>
+        </w:rPr>
+      </w:r>
+    </w:p>
+    <w:p>
+      <w:pPr>
+        <w:numPr>
+          <w:ilvl w:val="0"/>
+          <w:numId w:val="1"/>
+        </w:numPr>
+        <w:tabs>
+          <w:tab w:val="right" w:leader="none" w:pos="10770"/>
+        </w:tabs>
+        <w:spacing w:after="18" w:line="216" w:lineRule="auto"/>
+        <w:ind w:left="-180" w:right="-720" w:hanging="270"/>
+        <w:rPr>
+          <w:rFonts w:ascii="Calibri" w:cs="Calibri" w:eastAsia="Calibri" w:hAnsi="Calibri"/>
+        </w:rPr>
+      </w:pPr>
+      <w:r>
+        <w:rPr>
+          <w:rFonts w:ascii="Calibri" w:cs="Calibri" w:eastAsia="Calibri" w:hAnsi="Calibri"/>
+          <w:rtl w:val="0"/>
+        </w:rPr>
+        <w:t xml:space="preserve">Defined product strategy and user experience from zero for a DTC e-commerce brand, identifying target user needs through market research and iterating on product assortment, pricing, and positioning across 540+ SKUs</w:t>
+      </w:r>
+    </w:p>
+    <w:p>
+      <w:pPr>
+        <w:numPr>
+          <w:ilvl w:val="0"/>
+          <w:numId w:val="1"/>
+        </w:numPr>
+        <w:tabs>
+          <w:tab w:val="right" w:leader="none" w:pos="10770"/>
+        </w:tabs>
+        <w:spacing w:after="18" w:line="216" w:lineRule="auto"/>
+        <w:ind w:left="-180" w:right="-720" w:hanging="270"/>
+        <w:rPr>
+          <w:rFonts w:ascii="Calibri" w:cs="Calibri" w:eastAsia="Calibri" w:hAnsi="Calibri"/>
+        </w:rPr>
+      </w:pPr>
+      <w:r>
+        <w:rPr>
+          <w:rFonts w:ascii="Calibri" w:cs="Calibri" w:eastAsia="Calibri" w:hAnsi="Calibri"/>
+          <w:rtl w:val="0"/>
+        </w:rPr>
+        <w:t xml:space="preserve">Designed and ran A/B-tested ad campaigns via Meta Ads Manager, translating performance data into prioritized product and creative decisions, growing to NTD $100K in revenue and 1,000+ organic followers within four months</w:t>
+      </w:r>
+      <w:r>
+        <w:rPr>
+          <w:rtl w:val="0"/>
+        </w:rPr>
+      </w:r>
+    </w:p>
+    <w:p>
+      <w:pPr>
+        <w:tabs>
+          <w:tab w:val="right" w:leader="none" w:pos="10770"/>
+        </w:tabs>
+        <w:spacing w:after="18" w:line="216" w:lineRule="auto"/>
+        <w:ind w:left="720" w:right="-720" w:firstLine="0"/>
+        <w:rPr>
+          <w:sz w:val="8"/>
+          <w:szCs w:val="8"/>
+        </w:rPr>
+      </w:pPr>
+      <w:r>
+        <w:rPr>
+          <w:rtl w:val="0"/>
+        </w:rPr>
+      </w:r>
+    </w:p>
+    <w:p>
+      <w:pPr>
+        <w:pBdr>
+          <w:top w:color="000000" w:space="0" w:sz="0" w:val="none"/>
+          <w:left w:color="000000" w:space="0" w:sz="0" w:val="none"/>
+          <w:bottom w:color="000000" w:space="0" w:sz="6" w:val="single"/>
+          <w:right w:color="000000" w:space="0" w:sz="0" w:val="none"/>
+        </w:pBdr>
+        <w:spacing w:after="18" w:line="216" w:lineRule="auto"/>
+        <w:ind w:left="-540" w:right="-720" w:hanging="180"/>
+        <w:rPr>
+          <w:rFonts w:ascii="Calibri" w:cs="Calibri" w:eastAsia="Calibri" w:hAnsi="Calibri"/>
+          <w:b w:val="1"/>
+          <w:bCs w:val="1"/>
+          <w:smallCaps w:val="1"/>
+        </w:rPr>
+      </w:pPr>
+      <w:r>
+        <w:rPr>
+          <w:rFonts w:ascii="Calibri" w:cs="Calibri" w:eastAsia="Calibri" w:hAnsi="Calibri"/>
+          <w:b w:val="1"/>
+          <w:bCs w:val="1"/>
+          <w:smallCaps w:val="1"/>
+          <w:rtl w:val="0"/>
+        </w:rPr>
+        <w:t xml:space="preserve">ACADEMIC PROJECTS</w:t>
+      </w:r>
+    </w:p>
+    <w:p>
+      <w:pPr>
+        <w:tabs>
+          <w:tab w:val="right" w:leader="none" w:pos="10770"/>
+        </w:tabs>
+        <w:spacing w:line="240" w:lineRule="auto"/>
+        <w:ind w:left="-540" w:right="-720" w:hanging="180"/>
+        <w:rPr>
+          <w:rFonts w:ascii="Calibri" w:cs="Calibri" w:eastAsia="Calibri" w:hAnsi="Calibri"/>
+        </w:rPr>
+      </w:pPr>
+      <w:r>
+        <w:rPr>
+          <w:rFonts w:ascii="Calibri" w:cs="Calibri" w:eastAsia="Calibri" w:hAnsi="Calibri"/>
+          <w:b w:val="1"/>
+          <w:bCs w:val="1"/>
+          <w:rtl w:val="0"/>
+        </w:rPr>
+        <w:t xml:space="preserve">Florida Housing Price Prediction - Boston University</w:t>
+      </w:r>
+      <w:r>
+        <w:rPr>
+          <w:rFonts w:ascii="Calibri" w:cs="Calibri" w:eastAsia="Calibri" w:hAnsi="Calibri"/>
+          <w:rtl w:val="0"/>
+        </w:rPr>
+        <w:tab/>
+        <w:t xml:space="preserve">November 2025 - December 2025</w:t>
+      </w:r>
+    </w:p>
+    <w:p>
+      <w:pPr>
+        <w:tabs>
+          <w:tab w:val="right" w:leader="none" w:pos="10770"/>
+        </w:tabs>
+        <w:spacing w:line="240" w:lineRule="auto"/>
+        <w:ind w:left="-540" w:right="-720" w:hanging="180"/>
+        <w:rPr>
+          <w:rFonts w:ascii="Calibri" w:cs="Calibri" w:eastAsia="Calibri" w:hAnsi="Calibri"/>
+          <w:b w:val="1"/>
+          <w:bCs w:val="1"/>
+        </w:rPr>
+      </w:pPr>
+      <w:r>
+        <w:rPr>
+          <w:rFonts w:ascii="Calibri" w:cs="Calibri" w:eastAsia="Calibri" w:hAnsi="Calibri"/>
+          <w:rtl w:val="0"/>
+        </w:rPr>
+        <w:t xml:space="preserve">Course Project BA810 </w:t>
+      </w:r>
+      <w:hyperlink r:id="rId6">
+        <w:r>
+          <w:rPr>
+            <w:rFonts w:ascii="Calibri" w:cs="Calibri" w:eastAsia="Calibri" w:hAnsi="Calibri"/>
+            <w:color w:val="1155cc"/>
+            <w:u w:val="single"/>
+            <w:rtl w:val="0"/>
+          </w:rPr>
+          <w:t xml:space="preserve">https://github.com/ypc0701-cmyk/Florida-Housing-Prediction.git</w:t>
+        </w:r>
+      </w:hyperlink>
+      <w:r>
+        <w:rPr>
+          <w:rFonts w:ascii="Calibri" w:cs="Calibri" w:eastAsia="Calibri" w:hAnsi="Calibri"/>
+          <w:rtl w:val="0"/>
+        </w:rPr>
+        <w:t xml:space="preserve"> </w:t>
+        <w:tab/>
+        <w:t xml:space="preserve">Boston, MA</w:t>
+      </w:r>
+      <w:r>
+        <w:rPr>
+          <w:rtl w:val="0"/>
+        </w:rPr>
+      </w:r>
+    </w:p>
+    <w:p>
+      <w:pPr>
+        <w:numPr>
+          <w:ilvl w:val="0"/>
+          <w:numId w:val="2"/>
+        </w:numPr>
+        <w:tabs>
+          <w:tab w:val="right" w:leader="none" w:pos="10770"/>
+        </w:tabs>
+        <w:spacing w:after="18" w:line="216" w:lineRule="auto"/>
+        <w:ind w:left="-180" w:right="-720" w:hanging="270"/>
+        <w:rPr>
+          <w:rFonts w:ascii="Calibri" w:cs="Calibri" w:eastAsia="Calibri" w:hAnsi="Calibri"/>
+        </w:rPr>
+      </w:pPr>
+      <w:r>
+        <w:rPr>
+          <w:rFonts w:ascii="Calibri" w:cs="Calibri" w:eastAsia="Calibri" w:hAnsi="Calibri"/>
+          <w:rtl w:val="0"/>
+        </w:rPr>
+        <w:t xml:space="preserve">Designed and executed end-to-end data pipeline including data ingestion, cleaning, preprocessing, and feature engineering. Built, tuned, and evaluated four ML models on holdout test set.</w:t>
+      </w:r>
+      <w:r>
+        <w:rPr>
+          <w:rtl w:val="0"/>
+        </w:rPr>
+      </w:r>
+    </w:p>
+    <w:p>
+      <w:pPr>
+        <w:pBdr>
+          <w:top w:color="000000" w:space="0" w:sz="0" w:val="none"/>
+          <w:left w:color="000000" w:space="0" w:sz="0" w:val="none"/>
+          <w:bottom w:color="000000" w:space="0" w:sz="0" w:val="none"/>
+          <w:right w:color="000000" w:space="0" w:sz="0" w:val="none"/>
+        </w:pBdr>
+        <w:spacing w:line="240" w:lineRule="auto"/>
+        <w:ind w:left="720" w:right="-720" w:firstLine="0"/>
+        <w:rPr>
+          <w:rFonts w:ascii="Calibri" w:cs="Calibri" w:eastAsia="Calibri" w:hAnsi="Calibri"/>
+          <w:sz w:val="12"/>
+          <w:szCs w:val="12"/>
+        </w:rPr>
+      </w:pPr>
+      <w:r>
+        <w:rPr>
+          <w:rtl w:val="0"/>
+        </w:rPr>
+      </w:r>
+    </w:p>
+    <w:p>
+      <w:pPr>
+        <w:tabs>
+          <w:tab w:val="right" w:leader="none" w:pos="10770"/>
+        </w:tabs>
+        <w:spacing w:line="240" w:lineRule="auto"/>
+        <w:ind w:left="-180" w:right="-720" w:hanging="540"/>
+        <w:rPr>
+          <w:rFonts w:ascii="Calibri" w:cs="Calibri" w:eastAsia="Calibri" w:hAnsi="Calibri"/>
+        </w:rPr>
+      </w:pPr>
+      <w:r>
+        <w:rPr>
+          <w:rFonts w:ascii="Calibri" w:cs="Calibri" w:eastAsia="Calibri" w:hAnsi="Calibri"/>
+          <w:b w:val="1"/>
+          <w:bCs w:val="1"/>
+          <w:rtl w:val="0"/>
+        </w:rPr>
+        <w:t xml:space="preserve">Amazon Holiday Shopping Analysis - Boston University</w:t>
+      </w:r>
+      <w:r>
+        <w:rPr>
+          <w:rFonts w:ascii="Calibri" w:cs="Calibri" w:eastAsia="Calibri" w:hAnsi="Calibri"/>
+          <w:rtl w:val="0"/>
+        </w:rPr>
+        <w:tab/>
+        <w:t xml:space="preserve">September 2025 - October 2025</w:t>
+      </w:r>
+    </w:p>
+    <w:p>
+      <w:pPr>
+        <w:tabs>
+          <w:tab w:val="right" w:leader="none" w:pos="10770"/>
+        </w:tabs>
+        <w:spacing w:line="240" w:lineRule="auto"/>
+        <w:ind w:left="-180" w:right="-720" w:hanging="540"/>
+        <w:rPr>
+          <w:rFonts w:ascii="Calibri" w:cs="Calibri" w:eastAsia="Calibri" w:hAnsi="Calibri"/>
+        </w:rPr>
+      </w:pPr>
+      <w:r>
+        <w:rPr>
+          <w:rFonts w:ascii="Calibri" w:cs="Calibri" w:eastAsia="Calibri" w:hAnsi="Calibri"/>
+          <w:rtl w:val="0"/>
+        </w:rPr>
+        <w:t xml:space="preserve">Course Project BA780 </w:t>
+      </w:r>
+      <w:hyperlink r:id="rId7">
+        <w:r>
+          <w:rPr>
+            <w:rFonts w:ascii="Calibri" w:cs="Calibri" w:eastAsia="Calibri" w:hAnsi="Calibri"/>
+            <w:color w:val="1155cc"/>
+            <w:u w:val="single"/>
+            <w:rtl w:val="0"/>
+          </w:rPr>
+          <w:t xml:space="preserve">https://github.com/ypc0701-cmyk/B03-Project-Amazon-Holiday-Shopping-Analysis</w:t>
+        </w:r>
+      </w:hyperlink>
+      <w:r>
+        <w:rPr>
+          <w:rFonts w:ascii="Calibri" w:cs="Calibri" w:eastAsia="Calibri" w:hAnsi="Calibri"/>
+          <w:rtl w:val="0"/>
+        </w:rPr>
+        <w:t xml:space="preserve">       Boston, MA</w:t>
       </w:r>
     </w:p>
     <w:p>
@@ -491,84 +1030,7 @@
           <w:rFonts w:ascii="Calibri" w:cs="Calibri" w:eastAsia="Calibri" w:hAnsi="Calibri"/>
           <w:rtl w:val="0"/>
         </w:rPr>
-        <w:t xml:space="preserve">Designed and implemented an automated daily data pipeline (extraction, cleaning, upload), reducing manual processing time by 99%</w:t>
-      </w:r>
-    </w:p>
-    <w:p>
-      <w:pPr>
-        <w:tabs>
-          <w:tab w:val="right" w:leader="none" w:pos="10770"/>
-        </w:tabs>
-        <w:spacing w:after="18" w:line="216" w:lineRule="auto"/>
-        <w:ind w:left="720" w:right="-720" w:firstLine="0"/>
-        <w:rPr>
-          <w:rFonts w:ascii="Calibri" w:cs="Calibri" w:eastAsia="Calibri" w:hAnsi="Calibri"/>
-          <w:sz w:val="8"/>
-          <w:szCs w:val="8"/>
-        </w:rPr>
-      </w:pPr>
-      <w:r>
-        <w:rPr>
-          <w:rtl w:val="0"/>
-        </w:rPr>
-      </w:r>
-    </w:p>
-    <w:p>
-      <w:pPr>
-        <w:tabs>
-          <w:tab w:val="right" w:leader="none" w:pos="10770"/>
-        </w:tabs>
-        <w:spacing w:after="18" w:line="216" w:lineRule="auto"/>
-        <w:ind w:left="-540" w:right="-720" w:hanging="180"/>
-        <w:rPr>
-          <w:rFonts w:ascii="Calibri" w:cs="Calibri" w:eastAsia="Calibri" w:hAnsi="Calibri"/>
-        </w:rPr>
-      </w:pPr>
-      <w:r>
-        <w:rPr>
-          <w:rFonts w:ascii="Calibri" w:cs="Calibri" w:eastAsia="Calibri" w:hAnsi="Calibri"/>
-          <w:b w:val="1"/>
-          <w:bCs w:val="1"/>
-          <w:rtl w:val="0"/>
-        </w:rPr>
-        <w:t xml:space="preserve">Marketing Intern</w:t>
-      </w:r>
-      <w:r>
-        <w:rPr>
-          <w:rFonts w:ascii="Calibri" w:cs="Calibri" w:eastAsia="Calibri" w:hAnsi="Calibri"/>
-          <w:rtl w:val="0"/>
-        </w:rPr>
-        <w:tab/>
-        <w:t xml:space="preserve">February 2024 - June 2024</w:t>
-      </w:r>
-    </w:p>
-    <w:p>
-      <w:pPr>
-        <w:tabs>
-          <w:tab w:val="right" w:leader="none" w:pos="10770"/>
-        </w:tabs>
-        <w:spacing w:after="18" w:line="216" w:lineRule="auto"/>
-        <w:ind w:left="-540" w:right="-720" w:hanging="180"/>
-        <w:rPr>
-          <w:b w:val="1"/>
-          <w:bCs w:val="1"/>
-          <w:sz w:val="19"/>
-          <w:szCs w:val="19"/>
-        </w:rPr>
-      </w:pPr>
-      <w:r>
-        <w:rPr>
-          <w:rFonts w:ascii="Calibri" w:cs="Calibri" w:eastAsia="Calibri" w:hAnsi="Calibri"/>
-          <w:rtl w:val="0"/>
-        </w:rPr>
-        <w:t xml:space="preserve">Growth Strategy (LLC)</w:t>
-        <w:tab/>
-        <w:t xml:space="preserve">Taipei City, TW</w:t>
-      </w:r>
-      <w:r>
-        <w:rPr>
-          <w:rtl w:val="0"/>
-        </w:rPr>
+        <w:t xml:space="preserve">Analyzed 1.8M Amazon transactions to uncover holiday demand patterns and category growth opportunities</w:t>
       </w:r>
     </w:p>
     <w:p>
@@ -604,43 +1066,31 @@
           <w:rFonts w:ascii="Calibri" w:cs="Calibri" w:eastAsia="Calibri" w:hAnsi="Calibri"/>
           <w:rtl w:val="0"/>
         </w:rPr>
-        <w:t xml:space="preserve">Conducted multi-industry market research and translated business requirements into structured, data-driven recommendations for product and packaging strategy optimization</w:t>
-      </w:r>
-    </w:p>
-    <w:p>
-      <w:pPr>
-        <w:keepNext w:val="0"/>
-        <w:keepLines w:val="0"/>
-        <w:pageBreakBefore w:val="0"/>
-        <w:widowControl w:val="1"/>
-        <w:numPr>
-          <w:ilvl w:val="0"/>
-          <w:numId w:val="1"/>
-        </w:numPr>
-        <w:pBdr>
-          <w:top w:space="0" w:sz="0" w:val="nil"/>
-          <w:left w:space="0" w:sz="0" w:val="nil"/>
-          <w:bottom w:space="0" w:sz="0" w:val="nil"/>
-          <w:right w:space="0" w:sz="0" w:val="nil"/>
-          <w:between w:space="0" w:sz="0" w:val="nil"/>
-        </w:pBdr>
-        <w:shd w:fill="auto" w:val="clear"/>
-        <w:tabs>
-          <w:tab w:val="right" w:leader="none" w:pos="10770"/>
-        </w:tabs>
-        <w:spacing w:after="18" w:before="0" w:line="216" w:lineRule="auto"/>
-        <w:ind w:left="-180" w:right="-720" w:hanging="270"/>
-        <w:jc w:val="left"/>
-        <w:rPr>
-          <w:rFonts w:ascii="Calibri" w:cs="Calibri" w:eastAsia="Calibri" w:hAnsi="Calibri"/>
-        </w:rPr>
-      </w:pPr>
-      <w:r>
-        <w:rPr>
-          <w:rFonts w:ascii="Calibri" w:cs="Calibri" w:eastAsia="Calibri" w:hAnsi="Calibri"/>
-          <w:rtl w:val="0"/>
-        </w:rPr>
-        <w:t xml:space="preserve">Maintained data tracking systems across 10+ client accounts, ensuring accuracy and consistency of campaign performance metrics</w:t>
+        <w:t xml:space="preserve">Analyzed 1.8M Amazon transactions; identified top gift-buying categories (Electronics +40%, Home +28%, Outdoor +23%) and primary demographic segment (middle-income women 25–44) * Delivered strategic recommendations on customer targeting and product prioritization</w:t>
+      </w:r>
+      <w:r>
+        <w:rPr>
+          <w:rtl w:val="0"/>
+        </w:rPr>
+      </w:r>
+    </w:p>
+    <w:p>
+      <w:pPr>
+        <w:tabs>
+          <w:tab w:val="right" w:leader="none" w:pos="10770"/>
+        </w:tabs>
+        <w:spacing w:after="18" w:line="216" w:lineRule="auto"/>
+        <w:ind w:right="-720"/>
+        <w:rPr>
+          <w:rFonts w:ascii="Calibri" w:cs="Calibri" w:eastAsia="Calibri" w:hAnsi="Calibri"/>
+          <w:sz w:val="6"/>
+          <w:szCs w:val="6"/>
+        </w:rPr>
+      </w:pPr>
+      <w:r>
+        <w:rPr>
+          <w:rtl w:val="0"/>
+        </w:rPr>
       </w:r>
     </w:p>
     <w:p>
@@ -652,157 +1102,8 @@
         <w:ind w:left="720" w:right="-720" w:firstLine="0"/>
         <w:rPr>
           <w:rFonts w:ascii="Calibri" w:cs="Calibri" w:eastAsia="Calibri" w:hAnsi="Calibri"/>
-          <w:sz w:val="8"/>
-          <w:szCs w:val="8"/>
-        </w:rPr>
-      </w:pPr>
-      <w:r>
-        <w:rPr>
-          <w:rtl w:val="0"/>
-        </w:rPr>
-      </w:r>
-    </w:p>
-    <w:p>
-      <w:pPr>
-        <w:tabs>
-          <w:tab w:val="right" w:leader="none" w:pos="10770"/>
-        </w:tabs>
-        <w:spacing w:after="18" w:line="216" w:lineRule="auto"/>
-        <w:ind w:left="-540" w:right="-720" w:hanging="180"/>
-        <w:rPr>
-          <w:rFonts w:ascii="Calibri" w:cs="Calibri" w:eastAsia="Calibri" w:hAnsi="Calibri"/>
-        </w:rPr>
-      </w:pPr>
-      <w:r>
-        <w:rPr>
-          <w:rFonts w:ascii="Calibri" w:cs="Calibri" w:eastAsia="Calibri" w:hAnsi="Calibri"/>
-          <w:b w:val="1"/>
-          <w:bCs w:val="1"/>
-          <w:rtl w:val="0"/>
-        </w:rPr>
-        <w:t xml:space="preserve">Founder</w:t>
-      </w:r>
-      <w:r>
-        <w:rPr>
-          <w:rFonts w:ascii="Calibri" w:cs="Calibri" w:eastAsia="Calibri" w:hAnsi="Calibri"/>
-          <w:rtl w:val="0"/>
-        </w:rPr>
-        <w:tab/>
-        <w:t xml:space="preserve">September 2023 - April 2024</w:t>
-      </w:r>
-    </w:p>
-    <w:p>
-      <w:pPr>
-        <w:tabs>
-          <w:tab w:val="right" w:leader="none" w:pos="10770"/>
-        </w:tabs>
-        <w:spacing w:after="18" w:line="216" w:lineRule="auto"/>
-        <w:ind w:left="-540" w:right="-720" w:hanging="180"/>
-        <w:rPr>
-          <w:b w:val="1"/>
-          <w:bCs w:val="1"/>
-          <w:sz w:val="19"/>
-          <w:szCs w:val="19"/>
-        </w:rPr>
-      </w:pPr>
-      <w:r>
-        <w:rPr>
-          <w:rFonts w:ascii="Calibri" w:cs="Calibri" w:eastAsia="Calibri" w:hAnsi="Calibri"/>
-          <w:rtl w:val="0"/>
-        </w:rPr>
-        <w:t xml:space="preserve">Pour.selection (Online shop)</w:t>
-        <w:tab/>
-        <w:t xml:space="preserve">New Taipei City, TW</w:t>
-      </w:r>
-      <w:r>
-        <w:rPr>
-          <w:rtl w:val="0"/>
-        </w:rPr>
-      </w:r>
-    </w:p>
-    <w:p>
-      <w:pPr>
-        <w:keepNext w:val="0"/>
-        <w:keepLines w:val="0"/>
-        <w:pageBreakBefore w:val="0"/>
-        <w:widowControl w:val="1"/>
-        <w:numPr>
-          <w:ilvl w:val="0"/>
-          <w:numId w:val="1"/>
-        </w:numPr>
-        <w:pBdr>
-          <w:top w:space="0" w:sz="0" w:val="nil"/>
-          <w:left w:space="0" w:sz="0" w:val="nil"/>
-          <w:bottom w:space="0" w:sz="0" w:val="nil"/>
-          <w:right w:space="0" w:sz="0" w:val="nil"/>
-          <w:between w:space="0" w:sz="0" w:val="nil"/>
-        </w:pBdr>
-        <w:shd w:fill="auto" w:val="clear"/>
-        <w:tabs>
-          <w:tab w:val="right" w:leader="none" w:pos="10770"/>
-        </w:tabs>
-        <w:spacing w:after="18" w:before="0" w:line="216" w:lineRule="auto"/>
-        <w:ind w:left="-180" w:right="-720" w:hanging="270"/>
-        <w:jc w:val="left"/>
-        <w:rPr>
-          <w:rFonts w:ascii="Calibri" w:cs="Calibri" w:eastAsia="Calibri" w:hAnsi="Calibri"/>
-        </w:rPr>
-      </w:pPr>
-      <w:r>
-        <w:rPr>
-          <w:rFonts w:ascii="Calibri" w:cs="Calibri" w:eastAsia="Calibri" w:hAnsi="Calibri"/>
-          <w:rtl w:val="0"/>
-        </w:rPr>
-        <w:t xml:space="preserve">Designed and maintained data workflows to track product performance, customer demand trends, and inventory levels across 540+ SKUs</w:t>
-      </w:r>
-    </w:p>
-    <w:p>
-      <w:pPr>
-        <w:keepNext w:val="0"/>
-        <w:keepLines w:val="0"/>
-        <w:pageBreakBefore w:val="0"/>
-        <w:widowControl w:val="1"/>
-        <w:numPr>
-          <w:ilvl w:val="0"/>
-          <w:numId w:val="1"/>
-        </w:numPr>
-        <w:pBdr>
-          <w:top w:space="0" w:sz="0" w:val="nil"/>
-          <w:left w:space="0" w:sz="0" w:val="nil"/>
-          <w:bottom w:space="0" w:sz="0" w:val="nil"/>
-          <w:right w:space="0" w:sz="0" w:val="nil"/>
-          <w:between w:space="0" w:sz="0" w:val="nil"/>
-        </w:pBdr>
-        <w:shd w:fill="auto" w:val="clear"/>
-        <w:tabs>
-          <w:tab w:val="right" w:leader="none" w:pos="10770"/>
-        </w:tabs>
-        <w:spacing w:after="18" w:before="0" w:line="216" w:lineRule="auto"/>
-        <w:ind w:left="-180" w:right="-720" w:hanging="270"/>
-        <w:jc w:val="left"/>
-        <w:rPr>
-          <w:rFonts w:ascii="Calibri" w:cs="Calibri" w:eastAsia="Calibri" w:hAnsi="Calibri"/>
-        </w:rPr>
-      </w:pPr>
-      <w:r>
-        <w:rPr>
-          <w:rFonts w:ascii="Calibri" w:cs="Calibri" w:eastAsia="Calibri" w:hAnsi="Calibri"/>
-          <w:rtl w:val="0"/>
-        </w:rPr>
-        <w:t xml:space="preserve">Integrated data from multiple sources including Meta analytics and e-commerce platforms to build a unified view of sales performance and marketing effectiveness</w:t>
-      </w:r>
-    </w:p>
-    <w:p>
-      <w:pPr>
-        <w:tabs>
-          <w:tab w:val="right" w:leader="none" w:pos="10770"/>
-        </w:tabs>
-        <w:spacing w:after="18" w:line="216" w:lineRule="auto"/>
-        <w:ind w:left="720" w:right="-720" w:firstLine="0"/>
-        <w:rPr>
-          <w:rFonts w:ascii="Calibri" w:cs="Calibri" w:eastAsia="Calibri" w:hAnsi="Calibri"/>
-          <w:sz w:val="8"/>
-          <w:szCs w:val="8"/>
+          <w:sz w:val="6"/>
+          <w:szCs w:val="6"/>
         </w:rPr>
       </w:pPr>
       <w:r>
@@ -819,7 +1120,7 @@
           <w:bottom w:color="000000" w:space="0" w:sz="6" w:val="single"/>
           <w:right w:color="000000" w:space="0" w:sz="0" w:val="none"/>
         </w:pBdr>
-        <w:spacing w:after="30" w:line="192.00000000000003" w:lineRule="auto"/>
+        <w:spacing w:after="18" w:line="216" w:lineRule="auto"/>
         <w:ind w:left="-540" w:right="-720" w:hanging="180"/>
         <w:rPr>
           <w:rFonts w:ascii="Calibri" w:cs="Calibri" w:eastAsia="Calibri" w:hAnsi="Calibri"/>
@@ -836,355 +1137,37 @@
           <w:smallCaps w:val="1"/>
           <w:rtl w:val="0"/>
         </w:rPr>
-        <w:t xml:space="preserve">ACADEMIC PROJECTS</w:t>
-      </w:r>
-    </w:p>
-    <w:p>
-      <w:pPr>
-        <w:tabs>
-          <w:tab w:val="right" w:leader="none" w:pos="10770"/>
-        </w:tabs>
-        <w:spacing w:after="30" w:line="192.00000000000003" w:lineRule="auto"/>
-        <w:ind w:left="-540" w:right="-720" w:hanging="180"/>
-        <w:rPr>
-          <w:rFonts w:ascii="Calibri" w:cs="Calibri" w:eastAsia="Calibri" w:hAnsi="Calibri"/>
-        </w:rPr>
-      </w:pPr>
-      <w:r>
-        <w:rPr>
-          <w:rFonts w:ascii="Calibri" w:cs="Calibri" w:eastAsia="Calibri" w:hAnsi="Calibri"/>
-          <w:b w:val="1"/>
-          <w:bCs w:val="1"/>
-          <w:rtl w:val="0"/>
-        </w:rPr>
-        <w:t xml:space="preserve">Florida Housing Price Prediction - Boston University</w:t>
-      </w:r>
-      <w:r>
-        <w:rPr>
-          <w:rFonts w:ascii="Calibri" w:cs="Calibri" w:eastAsia="Calibri" w:hAnsi="Calibri"/>
-          <w:rtl w:val="0"/>
-        </w:rPr>
-        <w:tab/>
-        <w:t xml:space="preserve">November 2025 - December 2025</w:t>
-      </w:r>
-    </w:p>
-    <w:p>
-      <w:pPr>
-        <w:tabs>
-          <w:tab w:val="right" w:leader="none" w:pos="10770"/>
-        </w:tabs>
-        <w:spacing w:after="30" w:line="192.00000000000003" w:lineRule="auto"/>
-        <w:ind w:left="-540" w:right="-720" w:hanging="180"/>
-        <w:rPr>
-          <w:rFonts w:ascii="Calibri" w:cs="Calibri" w:eastAsia="Calibri" w:hAnsi="Calibri"/>
-        </w:rPr>
-      </w:pPr>
-      <w:r>
-        <w:rPr>
-          <w:rFonts w:ascii="Calibri" w:cs="Calibri" w:eastAsia="Calibri" w:hAnsi="Calibri"/>
-          <w:rtl w:val="0"/>
-        </w:rPr>
-        <w:t xml:space="preserve">Course Project BA810 </w:t>
-      </w:r>
-      <w:hyperlink r:id="rId6">
-        <w:r>
-          <w:rPr>
-            <w:rFonts w:ascii="Calibri" w:cs="Calibri" w:eastAsia="Calibri" w:hAnsi="Calibri"/>
-            <w:color w:val="1155cc"/>
-            <w:u w:val="single"/>
-            <w:rtl w:val="0"/>
-          </w:rPr>
-          <w:t xml:space="preserve">https://github.com/ypc0701-cmyk/Florida-Housing-Prediction.git</w:t>
-        </w:r>
-      </w:hyperlink>
-      <w:r>
-        <w:rPr>
-          <w:rFonts w:ascii="Calibri" w:cs="Calibri" w:eastAsia="Calibri" w:hAnsi="Calibri"/>
-          <w:rtl w:val="0"/>
-        </w:rPr>
-        <w:t xml:space="preserve"> </w:t>
-        <w:tab/>
-        <w:t xml:space="preserve">Boston, MA</w:t>
-      </w:r>
-    </w:p>
-    <w:p>
-      <w:pPr>
-        <w:tabs>
-          <w:tab w:val="right" w:leader="none" w:pos="10770"/>
-        </w:tabs>
-        <w:spacing w:after="30" w:line="192.00000000000003" w:lineRule="auto"/>
-        <w:ind w:left="-540" w:right="-720" w:hanging="180"/>
-        <w:rPr>
-          <w:rFonts w:ascii="Calibri" w:cs="Calibri" w:eastAsia="Calibri" w:hAnsi="Calibri"/>
-          <w:sz w:val="8"/>
-          <w:szCs w:val="8"/>
-        </w:rPr>
-      </w:pPr>
-      <w:r>
-        <w:rPr>
-          <w:rtl w:val="0"/>
-        </w:rPr>
-      </w:r>
-    </w:p>
-    <w:p>
-      <w:pPr>
-        <w:numPr>
-          <w:ilvl w:val="0"/>
-          <w:numId w:val="1"/>
-        </w:numPr>
-        <w:tabs>
-          <w:tab w:val="right" w:leader="none" w:pos="10770"/>
-        </w:tabs>
-        <w:spacing w:after="30" w:line="192.00000000000003" w:lineRule="auto"/>
-        <w:ind w:left="-180" w:right="-720" w:hanging="270"/>
-        <w:rPr>
-          <w:rFonts w:ascii="Calibri" w:cs="Calibri" w:eastAsia="Calibri" w:hAnsi="Calibri"/>
-        </w:rPr>
-      </w:pPr>
-      <w:r>
-        <w:rPr>
-          <w:rFonts w:ascii="Calibri" w:cs="Calibri" w:eastAsia="Calibri" w:hAnsi="Calibri"/>
-          <w:rtl w:val="0"/>
-        </w:rPr>
-        <w:t xml:space="preserve">Designed and executed an end-to-end data pipeline in Python including data ingestion, cleaning, preprocessing, and feature engineering to prepare large-scale structured datasets for modeling</w:t>
-      </w:r>
-    </w:p>
-    <w:p>
-      <w:pPr>
-        <w:numPr>
-          <w:ilvl w:val="0"/>
-          <w:numId w:val="1"/>
-        </w:numPr>
-        <w:tabs>
-          <w:tab w:val="right" w:leader="none" w:pos="10770"/>
-        </w:tabs>
-        <w:spacing w:after="30" w:line="192.00000000000003" w:lineRule="auto"/>
-        <w:ind w:left="-180" w:right="-720" w:hanging="270"/>
-        <w:rPr>
-          <w:rFonts w:ascii="Calibri" w:cs="Calibri" w:eastAsia="Calibri" w:hAnsi="Calibri"/>
-        </w:rPr>
-      </w:pPr>
-      <w:r>
-        <w:rPr>
-          <w:rFonts w:ascii="Calibri" w:cs="Calibri" w:eastAsia="Calibri" w:hAnsi="Calibri"/>
-          <w:rtl w:val="0"/>
-        </w:rPr>
-        <w:t xml:space="preserve">Built, tuned, and evaluated four machine learning models including linear regression, decision tree, random forest, and gradient boosting to predict housing prices</w:t>
-      </w:r>
-    </w:p>
-    <w:p>
-      <w:pPr>
-        <w:tabs>
-          <w:tab w:val="right" w:leader="none" w:pos="10770"/>
-        </w:tabs>
-        <w:spacing w:after="30" w:line="192.00000000000003" w:lineRule="auto"/>
-        <w:ind w:left="-180" w:right="-720" w:hanging="540"/>
-        <w:rPr>
-          <w:rFonts w:ascii="Calibri" w:cs="Calibri" w:eastAsia="Calibri" w:hAnsi="Calibri"/>
-        </w:rPr>
-      </w:pPr>
-      <w:r>
-        <w:rPr>
-          <w:rFonts w:ascii="Calibri" w:cs="Calibri" w:eastAsia="Calibri" w:hAnsi="Calibri"/>
-          <w:b w:val="1"/>
-          <w:bCs w:val="1"/>
-          <w:rtl w:val="0"/>
-        </w:rPr>
-        <w:t xml:space="preserve">Amazon Holiday Shopping Analysis - Boston University</w:t>
-      </w:r>
-      <w:r>
-        <w:rPr>
-          <w:rFonts w:ascii="Calibri" w:cs="Calibri" w:eastAsia="Calibri" w:hAnsi="Calibri"/>
-          <w:rtl w:val="0"/>
-        </w:rPr>
-        <w:tab/>
-        <w:t xml:space="preserve">September 2025 - October 2025</w:t>
-      </w:r>
-    </w:p>
-    <w:p>
-      <w:pPr>
-        <w:tabs>
-          <w:tab w:val="right" w:leader="none" w:pos="10770"/>
-        </w:tabs>
-        <w:spacing w:after="30" w:line="192.00000000000003" w:lineRule="auto"/>
-        <w:ind w:left="-180" w:right="-720" w:hanging="540"/>
-        <w:rPr>
-          <w:rFonts w:ascii="Calibri" w:cs="Calibri" w:eastAsia="Calibri" w:hAnsi="Calibri"/>
-        </w:rPr>
-      </w:pPr>
-      <w:r>
-        <w:rPr>
-          <w:rFonts w:ascii="Calibri" w:cs="Calibri" w:eastAsia="Calibri" w:hAnsi="Calibri"/>
-          <w:rtl w:val="0"/>
-        </w:rPr>
-        <w:t xml:space="preserve">Course Project BA780 </w:t>
-      </w:r>
-      <w:hyperlink r:id="rId7">
-        <w:r>
-          <w:rPr>
-            <w:rFonts w:ascii="Calibri" w:cs="Calibri" w:eastAsia="Calibri" w:hAnsi="Calibri"/>
-            <w:color w:val="1155cc"/>
-            <w:u w:val="single"/>
-            <w:rtl w:val="0"/>
-          </w:rPr>
-          <w:t xml:space="preserve">https://github.com/ypc0701-cmyk/B03-Project-Amazon-Holiday-Shopping-Analysis</w:t>
-        </w:r>
-      </w:hyperlink>
-      <w:r>
-        <w:rPr>
-          <w:rFonts w:ascii="Calibri" w:cs="Calibri" w:eastAsia="Calibri" w:hAnsi="Calibri"/>
-          <w:rtl w:val="0"/>
-        </w:rPr>
-        <w:t xml:space="preserve">       Boston, MA</w:t>
-      </w:r>
-    </w:p>
-    <w:p>
-      <w:pPr>
-        <w:tabs>
-          <w:tab w:val="right" w:leader="none" w:pos="10770"/>
-        </w:tabs>
-        <w:spacing w:after="30" w:line="192.00000000000003" w:lineRule="auto"/>
-        <w:ind w:left="-180" w:right="-720" w:hanging="540"/>
-        <w:rPr>
-          <w:rFonts w:ascii="Calibri" w:cs="Calibri" w:eastAsia="Calibri" w:hAnsi="Calibri"/>
-          <w:sz w:val="6"/>
-          <w:szCs w:val="6"/>
-        </w:rPr>
-      </w:pPr>
-      <w:r>
-        <w:rPr>
-          <w:rtl w:val="0"/>
-        </w:rPr>
-      </w:r>
-    </w:p>
-    <w:p>
-      <w:pPr>
-        <w:keepNext w:val="0"/>
-        <w:keepLines w:val="0"/>
-        <w:pageBreakBefore w:val="0"/>
-        <w:widowControl w:val="1"/>
-        <w:numPr>
-          <w:ilvl w:val="0"/>
-          <w:numId w:val="1"/>
-        </w:numPr>
-        <w:pBdr>
-          <w:top w:space="0" w:sz="0" w:val="nil"/>
-          <w:left w:space="0" w:sz="0" w:val="nil"/>
-          <w:bottom w:space="0" w:sz="0" w:val="nil"/>
-          <w:right w:space="0" w:sz="0" w:val="nil"/>
-          <w:between w:space="0" w:sz="0" w:val="nil"/>
-        </w:pBdr>
-        <w:shd w:fill="auto" w:val="clear"/>
-        <w:tabs>
-          <w:tab w:val="right" w:leader="none" w:pos="10770"/>
-        </w:tabs>
-        <w:spacing w:after="30" w:before="0" w:line="192.00000000000003" w:lineRule="auto"/>
-        <w:ind w:left="-180" w:right="-720" w:hanging="270"/>
-        <w:jc w:val="left"/>
-        <w:rPr>
-          <w:rFonts w:ascii="Calibri" w:cs="Calibri" w:eastAsia="Calibri" w:hAnsi="Calibri"/>
-        </w:rPr>
-      </w:pPr>
-      <w:r>
-        <w:rPr>
-          <w:rFonts w:ascii="Calibri" w:cs="Calibri" w:eastAsia="Calibri" w:hAnsi="Calibri"/>
-          <w:rtl w:val="0"/>
-        </w:rPr>
-        <w:t xml:space="preserve">Processed and analyzed 1.8M Amazon transactions using Python to uncover holiday demand patterns and category growth opportunities</w:t>
-      </w:r>
-    </w:p>
-    <w:p>
-      <w:pPr>
-        <w:keepNext w:val="0"/>
-        <w:keepLines w:val="0"/>
-        <w:pageBreakBefore w:val="0"/>
-        <w:widowControl w:val="1"/>
-        <w:numPr>
-          <w:ilvl w:val="0"/>
-          <w:numId w:val="1"/>
-        </w:numPr>
-        <w:pBdr>
-          <w:top w:space="0" w:sz="0" w:val="nil"/>
-          <w:left w:space="0" w:sz="0" w:val="nil"/>
-          <w:bottom w:space="0" w:sz="0" w:val="nil"/>
-          <w:right w:space="0" w:sz="0" w:val="nil"/>
-          <w:between w:space="0" w:sz="0" w:val="nil"/>
-        </w:pBdr>
-        <w:shd w:fill="auto" w:val="clear"/>
-        <w:tabs>
-          <w:tab w:val="right" w:leader="none" w:pos="10770"/>
-        </w:tabs>
-        <w:spacing w:after="30" w:before="0" w:line="192.00000000000003" w:lineRule="auto"/>
-        <w:ind w:left="-180" w:right="-720" w:hanging="270"/>
-        <w:jc w:val="left"/>
-        <w:rPr>
-          <w:rFonts w:ascii="Calibri" w:cs="Calibri" w:eastAsia="Calibri" w:hAnsi="Calibri"/>
-        </w:rPr>
-      </w:pPr>
-      <w:r>
-        <w:rPr>
-          <w:rFonts w:ascii="Calibri" w:cs="Calibri" w:eastAsia="Calibri" w:hAnsi="Calibri"/>
-          <w:rtl w:val="0"/>
-        </w:rPr>
-        <w:t xml:space="preserve">Designed data transformation and visualization workflows to extract insights from large-scale structured datasets across multiple categories and demographic segments</w:t>
-      </w:r>
-    </w:p>
-    <w:p>
-      <w:pPr>
-        <w:pBdr>
-          <w:top w:color="000000" w:space="0" w:sz="0" w:val="none"/>
-          <w:left w:color="000000" w:space="0" w:sz="0" w:val="none"/>
-          <w:bottom w:color="000000" w:space="0" w:sz="6" w:val="single"/>
-          <w:right w:color="000000" w:space="0" w:sz="0" w:val="none"/>
-        </w:pBdr>
-        <w:spacing w:after="30" w:line="192.00000000000003" w:lineRule="auto"/>
-        <w:ind w:left="-540" w:right="-720" w:hanging="180"/>
-        <w:rPr>
-          <w:rFonts w:ascii="Calibri" w:cs="Calibri" w:eastAsia="Calibri" w:hAnsi="Calibri"/>
-          <w:b w:val="1"/>
-          <w:bCs w:val="1"/>
-          <w:smallCaps w:val="1"/>
-        </w:rPr>
-      </w:pPr>
-      <w:r>
-        <w:rPr>
-          <w:rFonts w:ascii="Calibri" w:cs="Calibri" w:eastAsia="Calibri" w:hAnsi="Calibri"/>
-          <w:b w:val="1"/>
-          <w:bCs w:val="1"/>
-          <w:smallCaps w:val="1"/>
-          <w:rtl w:val="0"/>
-        </w:rPr>
         <w:t xml:space="preserve">SKILLS</w:t>
       </w:r>
     </w:p>
     <w:p>
       <w:pPr>
-        <w:spacing w:after="30" w:line="192.00000000000003" w:lineRule="auto"/>
-        <w:ind w:left="-540" w:right="-720" w:hanging="180"/>
-        <w:rPr>
-          <w:rFonts w:ascii="Calibri" w:cs="Calibri" w:eastAsia="Calibri" w:hAnsi="Calibri"/>
-        </w:rPr>
-      </w:pPr>
-      <w:r>
-        <w:rPr>
-          <w:rFonts w:ascii="Calibri" w:cs="Calibri" w:eastAsia="Calibri" w:hAnsi="Calibri"/>
-          <w:b w:val="1"/>
-          <w:bCs w:val="1"/>
-          <w:rtl w:val="0"/>
-        </w:rPr>
-        <w:t xml:space="preserve">Skills: </w:t>
-      </w:r>
-      <w:r>
-        <w:rPr>
-          <w:rFonts w:ascii="Calibri" w:cs="Calibri" w:eastAsia="Calibri" w:hAnsi="Calibri"/>
-          <w:rtl w:val="0"/>
-        </w:rPr>
-        <w:t xml:space="preserve">Python, SQL, Tableau, Looker Studio, R, Microsoft Office, Google Workspace, Machine Learning, Adobe, Canva</w:t>
-      </w:r>
-    </w:p>
-    <w:p>
-      <w:pPr>
-        <w:spacing w:after="30" w:line="192.00000000000003" w:lineRule="auto"/>
+        <w:spacing w:after="18" w:line="216" w:lineRule="auto"/>
+        <w:ind w:left="-540" w:right="-990" w:hanging="180"/>
+        <w:rPr>
+          <w:rFonts w:ascii="Calibri" w:cs="Calibri" w:eastAsia="Calibri" w:hAnsi="Calibri"/>
+        </w:rPr>
+      </w:pPr>
+      <w:r>
+        <w:rPr>
+          <w:rFonts w:ascii="Calibri" w:cs="Calibri" w:eastAsia="Calibri" w:hAnsi="Calibri"/>
+          <w:b w:val="1"/>
+          <w:bCs w:val="1"/>
+          <w:rtl w:val="0"/>
+        </w:rPr>
+        <w:t xml:space="preserve">Skills:</w:t>
+      </w:r>
+      <w:r>
+        <w:rPr>
+          <w:rFonts w:ascii="Calibri" w:cs="Calibri" w:eastAsia="Calibri" w:hAnsi="Calibri"/>
+          <w:rtl w:val="0"/>
+        </w:rPr>
+        <w:t xml:space="preserve"> Python, SQL, Tableau, R, ETL pipeline design, data automation, Microsoft Office, Google Workspace, Notion, Adobe</w:t>
+      </w:r>
+    </w:p>
+    <w:p>
+      <w:pPr>
+        <w:spacing w:after="18" w:line="216" w:lineRule="auto"/>
         <w:ind w:left="-540" w:right="-720" w:hanging="180"/>
         <w:rPr/>
       </w:pPr>
@@ -1195,14 +1178,14 @@
           <w:bCs w:val="1"/>
           <w:rtl w:val="0"/>
         </w:rPr>
-        <w:t xml:space="preserve">AI Tools: </w:t>
-      </w:r>
-      <w:r>
-        <w:rPr>
-          <w:rFonts w:ascii="Calibri" w:cs="Calibri" w:eastAsia="Calibri" w:hAnsi="Calibri"/>
-          <w:rtl w:val="0"/>
-        </w:rPr>
-        <w:t xml:space="preserve">ChatGPT, Gemini, Claude, Perplexity, NotebookLM</w:t>
+        <w:t xml:space="preserve">Language Skills: </w:t>
+      </w:r>
+      <w:r>
+        <w:rPr>
+          <w:rFonts w:ascii="Calibri" w:cs="Calibri" w:eastAsia="Calibri" w:hAnsi="Calibri"/>
+          <w:rtl w:val="0"/>
+        </w:rPr>
+        <w:t xml:space="preserve">Mandarin (Native), English (Fluent), French(Basic)</w:t>
       </w:r>
       <w:r>
         <w:rPr>
@@ -1212,28 +1195,12 @@
     </w:p>
     <w:sectPr>
       <w:headerReference r:id="rId8" w:type="default"/>
-      <w:footerReference r:id="rId9" w:type="default"/>
       <w:pgSz w:h="15840" w:w="12240" w:orient="portrait"/>
       <w:pgMar w:bottom="1440" w:top="1440" w:left="1440" w:right="1440" w:header="720" w:footer="720"/>
       <w:pgNumType w:start="1"/>
     </w:sectPr>
   </w:body>
 </w:document>
-</file>
-
-<file path=word/footer1.xml><?xml version="1.0" encoding="utf-8"?>
-<w:ftr xmlns:mc="http://schemas.openxmlformats.org/markup-compatibility/2006" xmlns:o="urn:schemas-microsoft-com:office:office" xmlns:r="http://schemas.openxmlformats.org/officeDocument/2006/relationships" xmlns:m="http://schemas.openxmlformats.org/officeDocument/2006/math" xmlns:v="urn:schemas-microsoft-com:vml" xmlns:wp="http://schemas.openxmlformats.org/drawingml/2006/wordprocessingDrawing" xmlns:w10="urn:schemas-microsoft-com:office:word" xmlns:w="http://schemas.openxmlformats.org/wordprocessingml/2006/main" xmlns:wne="http://schemas.microsoft.com/office/word/2006/wordml" xmlns:sl="http://schemas.openxmlformats.org/schemaLibrary/2006/main" xmlns:a="http://schemas.openxmlformats.org/drawingml/2006/main" xmlns:pic="http://schemas.openxmlformats.org/drawingml/2006/picture" xmlns:c="http://schemas.openxmlformats.org/drawingml/2006/chart" xmlns:lc="http://schemas.openxmlformats.org/drawingml/2006/lockedCanvas" xmlns:dgm="http://schemas.openxmlformats.org/drawingml/2006/diagram" xmlns:wps="http://schemas.microsoft.com/office/word/2010/wordprocessingShape" xmlns:wpg="http://schemas.microsoft.com/office/word/2010/wordprocessingGroup" xmlns:w14="http://schemas.microsoft.com/office/word/2010/wordml" xmlns:w15="http://schemas.microsoft.com/office/word/2012/wordml" xmlns:w16="http://schemas.microsoft.com/office/word/2018/wordml" xmlns:w16cex="http://schemas.microsoft.com/office/word/2018/wordml/cex" xmlns:w16cid="http://schemas.microsoft.com/office/word/2016/wordml/cid" xmlns="http://schemas.microsoft.com/office/tasks/2019/documenttasks" xmlns:cr="http://schemas.microsoft.com/office/comments/2020/reactions">
-  <w:p>
-    <w:pPr>
-      <w:rPr/>
-    </w:pPr>
-    <w:r>
-      <w:rPr>
-        <w:rtl w:val="0"/>
-      </w:rPr>
-    </w:r>
-  </w:p>
-</w:ftr>
 </file>
 
 <file path=word/header1.xml><?xml version="1.0" encoding="utf-8"?>
@@ -1413,8 +1380,121 @@
       </w:rPr>
     </w:lvl>
   </w:abstractNum>
+  <w:abstractNum w:abstractNumId="2">
+    <w:lvl w:ilvl="0">
+      <w:start w:val="1"/>
+      <w:numFmt w:val="bullet"/>
+      <w:lvlText w:val="●"/>
+      <w:lvlJc w:val="left"/>
+      <w:pPr>
+        <w:ind w:left="720" w:hanging="360"/>
+      </w:pPr>
+      <w:rPr>
+        <w:u w:val="none"/>
+      </w:rPr>
+    </w:lvl>
+    <w:lvl w:ilvl="1">
+      <w:start w:val="1"/>
+      <w:numFmt w:val="bullet"/>
+      <w:lvlText w:val="o"/>
+      <w:lvlJc w:val="left"/>
+      <w:pPr>
+        <w:ind w:left="1440" w:hanging="360"/>
+      </w:pPr>
+      <w:rPr>
+        <w:u w:val="none"/>
+      </w:rPr>
+    </w:lvl>
+    <w:lvl w:ilvl="2">
+      <w:start w:val="1"/>
+      <w:numFmt w:val="bullet"/>
+      <w:lvlText w:val="▪"/>
+      <w:lvlJc w:val="left"/>
+      <w:pPr>
+        <w:ind w:left="2160" w:hanging="360"/>
+      </w:pPr>
+      <w:rPr>
+        <w:u w:val="none"/>
+      </w:rPr>
+    </w:lvl>
+    <w:lvl w:ilvl="3">
+      <w:start w:val="1"/>
+      <w:numFmt w:val="bullet"/>
+      <w:lvlText w:val="●"/>
+      <w:lvlJc w:val="left"/>
+      <w:pPr>
+        <w:ind w:left="2880" w:hanging="360"/>
+      </w:pPr>
+      <w:rPr>
+        <w:u w:val="none"/>
+      </w:rPr>
+    </w:lvl>
+    <w:lvl w:ilvl="4">
+      <w:start w:val="1"/>
+      <w:numFmt w:val="bullet"/>
+      <w:lvlText w:val="o"/>
+      <w:lvlJc w:val="left"/>
+      <w:pPr>
+        <w:ind w:left="3600" w:hanging="360"/>
+      </w:pPr>
+      <w:rPr>
+        <w:u w:val="none"/>
+      </w:rPr>
+    </w:lvl>
+    <w:lvl w:ilvl="5">
+      <w:start w:val="1"/>
+      <w:numFmt w:val="bullet"/>
+      <w:lvlText w:val="▪"/>
+      <w:lvlJc w:val="left"/>
+      <w:pPr>
+        <w:ind w:left="4320" w:hanging="360"/>
+      </w:pPr>
+      <w:rPr>
+        <w:u w:val="none"/>
+      </w:rPr>
+    </w:lvl>
+    <w:lvl w:ilvl="6">
+      <w:start w:val="1"/>
+      <w:numFmt w:val="bullet"/>
+      <w:lvlText w:val="●"/>
+      <w:lvlJc w:val="left"/>
+      <w:pPr>
+        <w:ind w:left="5040" w:hanging="360"/>
+      </w:pPr>
+      <w:rPr>
+        <w:u w:val="none"/>
+      </w:rPr>
+    </w:lvl>
+    <w:lvl w:ilvl="7">
+      <w:start w:val="1"/>
+      <w:numFmt w:val="bullet"/>
+      <w:lvlText w:val="o"/>
+      <w:lvlJc w:val="left"/>
+      <w:pPr>
+        <w:ind w:left="5760" w:hanging="360"/>
+      </w:pPr>
+      <w:rPr>
+        <w:u w:val="none"/>
+      </w:rPr>
+    </w:lvl>
+    <w:lvl w:ilvl="8">
+      <w:start w:val="1"/>
+      <w:numFmt w:val="bullet"/>
+      <w:lvlText w:val="▪"/>
+      <w:lvlJc w:val="left"/>
+      <w:pPr>
+        <w:ind w:left="6480" w:hanging="360"/>
+      </w:pPr>
+      <w:rPr>
+        <w:u w:val="none"/>
+      </w:rPr>
+    </w:lvl>
+  </w:abstractNum>
   <w:num w:numId="1">
     <w:abstractNumId w:val="1"/>
+  </w:num>
+  <w:num w:numId="2">
+    <w:abstractNumId w:val="2"/>
   </w:num>
 </w:numbering>
 </file>

</xml_diff>